<commit_message>
Final report and README
</commit_message>
<xml_diff>
--- a/report/MLOps_Assignment1_Report_2025AE05303.docx
+++ b/report/MLOps_Assignment1_Report_2025AE05303.docx
@@ -391,7 +391,7 @@
               <w:spacing w:after="0" w:line="222"/>
               <w:jc w:val="left"/>
             </w:pPr>
-            <w:hyperlink w:history="1" r:id="rIdlb1nwpkesjvgdffyjtul-">
+            <w:hyperlink w:history="1" r:id="rId8di0qt9k6f-lml-hoeb5p">
               <w:r>
                 <w:rPr>
                   <w:color w:val="0563C1"/>
@@ -469,7 +469,7 @@
               <w:spacing w:after="0" w:line="222"/>
               <w:jc w:val="left"/>
             </w:pPr>
-            <w:hyperlink w:history="1" r:id="rIdve6iwsy8lfsk2dltd4whm">
+            <w:hyperlink w:history="1" r:id="rIdsckjcwoy9eaaf6nawpsqn">
               <w:r>
                 <w:rPr>
                   <w:color w:val="0563C1"/>
@@ -644,7 +644,7 @@
         <w:jc w:val="both"/>
       </w:pPr>
       <w:r>
-        <w:t xml:space="preserve">This report presents the design and implementation of a production-grade machine-learning system that estimates the risk of heart disease from thirteen routine clinical measurements, using the Cleveland subset of the UCI Heart Disease dataset [1]. Beyond training an accurate classifier, the work addresses the operational concerns that MLOps practice identifies as the main source of failure in deployed models [2]: data integrity, experiment traceability, reproducibility, automated verification, safe deployment and post-deployment monitoring. Three model families were tuned with stratified five-fold cross-validation and compared under a selection rule declared before training; Logistic Regression was selected with a cross-validated ROC-AUC of 0.911 ± 0.018 and achieved a ROC-AUC of 0.961 and a recall of 0.929 on 61 held-out patients. All runs are recorded in MLflow with a model registry. A five-stage GitHub Actions pipeline enforces 199 automated tests (99 % line coverage), a model quality gate, container verification and a Kubernetes deployment test on every change. Deployed on Kubernetes, the FastAPI service served 22,880 requests without error while autoscaling from two to five replicas, and its Prometheus/Grafana monitoring detected a deliberately shifted patient population within five minutes. The complete training pipeline was re-executed on the BITS Prayogshala virtual lab with identical results.</w:t>
+        <w:t xml:space="preserve">This report presents the design and implementation of a production-oriented machine-learning prototype that estimates the risk of heart disease from thirteen routine clinical measurements, using the Cleveland subset of the UCI Heart Disease dataset [1]. Beyond training an accurate classifier, the work addresses the operational concerns that MLOps practice identifies as the main source of failure in deployed models [2]: data integrity, experiment traceability, reproducibility, automated verification, safe deployment and post-deployment monitoring. Three model families were tuned with stratified five-fold cross-validation and compared under a selection rule declared before training; Logistic Regression was selected with a cross-validated ROC-AUC of 0.911 ± 0.018 and achieved a ROC-AUC of 0.961 and a recall of 0.929 on 61 held-out patients. All runs are recorded in MLflow with a model registry. A five-stage GitHub Actions pipeline enforces 199 automated tests (99 % line coverage), a model quality gate, container verification and a Kubernetes deployment test on every change. Deployed on local Kubernetes, the FastAPI service handled a 22,880-request load test with no connection or server errors while autoscaling from two to five replicas, and its Prometheus/Grafana monitoring detected a deliberately shifted patient population within five minutes. The complete training pipeline was re-executed on the BITS Prayogshala virtual lab with identical results.</w:t>
       </w:r>
     </w:p>
     <w:p>
@@ -6749,7 +6749,7 @@
           <w:sz w:val="16"/>
           <w:szCs w:val="16"/>
         </w:rPr>
-        <w:t xml:space="preserve">Packaged model artifacts in the `models/` directory.</w:t>
+        <w:t xml:space="preserve">Packaged model artifacts in the models/ directory.</w:t>
       </w:r>
     </w:p>
     <w:tbl>
@@ -8172,7 +8172,7 @@
         <w:jc w:val="both"/>
       </w:pPr>
       <w:r>
-        <w:t xml:space="preserve">Following the ML Test Score rubric [9], the test suite covers not only code paths but also the data, the model and the infrastructure. It consists of 199 Pytest tests with 99 % line coverage; the tests run offline and deterministically, and those involving training use a small but real grid with real MLflow logging so that they finish in seconds. The same suite was also executed on BITS Prayogshala, where all 199 tests passed with 99 % coverage (Figure 9, right).</w:t>
+        <w:t xml:space="preserve">Following the ML Test Score rubric [9], the test suite covers not only code paths but also the data, the model and the infrastructure. It consists of 199 Pytest tests; the tests run offline and deterministically, and those involving training use a small but real grid with real MLflow logging so that they finish in seconds. With the locked library versions all 199 tests pass at 99 % line coverage — on the laptop, in the CI training job and on BITS Prayogshala (Figure 9, right). In the CI matrix job on Python 3.10, three tests that load the committed model are skipped by design, because the scikit-learn release used for training requires Python 3.11 or later; that job therefore reports 196 passed, 3 skipped and 98.7 % coverage (Figure 10).</w:t>
       </w:r>
     </w:p>
     <w:p>
@@ -9326,9 +9326,9 @@
       <w:r>
         <w:drawing>
           <wp:inline distT="0" distB="0" distL="0" distR="0">
-            <wp:extent cx="4638675" cy="1533525"/>
+            <wp:extent cx="4124325" cy="1362075"/>
             <wp:effectExtent t="0" r="0" b="0" l="0"/>
-            <wp:docPr id="1" name="c_task8_09_ci.png" descr="A complete pipeline run on the main branch: all five jobs succeed in 14 min 41 s, nine artifacts are uploaded, and the job summary reports 196 tests passed on Python 3.10 with 98.7 % coverage." title="c_task8_09_ci.png"/>
+            <wp:docPr id="1" name="c_task8_09_ci.png" descr="A complete pipeline run on the main branch: all five jobs succeed in 14 min 41 s, nine artifacts are uploaded, and the Python 3.10 job summary reports 196 passed and 3 skipped by design (98.7 % coverage)." title="c_task8_09_ci.png"/>
             <wp:cNvGraphicFramePr>
               <a:graphicFrameLocks xmlns:a="http://schemas.openxmlformats.org/drawingml/2006/main" noChangeAspect="1"/>
             </wp:cNvGraphicFramePr>
@@ -9351,7 +9351,7 @@
                   <pic:spPr bwMode="auto">
                     <a:xfrm>
                       <a:off x="0" y="0"/>
-                      <a:ext cx="4638675" cy="1533525"/>
+                      <a:ext cx="4124325" cy="1362075"/>
                     </a:xfrm>
                     <a:prstGeom prst="rect">
                       <a:avLst/>
@@ -9387,7 +9387,7 @@
           <w:sz w:val="16"/>
           <w:szCs w:val="16"/>
         </w:rPr>
-        <w:t xml:space="preserve">A complete pipeline run on the main branch: all five jobs succeed in 14 min 41 s, nine artifacts are uploaded, and the job summary reports 196 tests passed on Python 3.10 with 98.7 % coverage.</w:t>
+        <w:t xml:space="preserve">A complete pipeline run on the main branch: all five jobs succeed in 14 min 41 s, nine artifacts are uploaded, and the Python 3.10 job summary reports 196 passed and 3 skipped by design (98.7 % coverage).</w:t>
       </w:r>
     </w:p>
     <w:p>
@@ -9724,7 +9724,7 @@
                 <w:sz w:val="16"/>
                 <w:szCs w:val="16"/>
               </w:rPr>
-              <w:t xml:space="preserve">Accepts one patient (13 attributes as JSON) and returns the predicted class, label, probability of disease, confidence, model version and a request identifier.</w:t>
+              <w:t xml:space="preserve">Accepts one patient (13 attributes as JSON) and returns the predicted class, label, probability of disease, confidence (the probability of the predicted class, i.e. max(p, 1 − p)), model version and a request identifier.</w:t>
             </w:r>
           </w:p>
         </w:tc>
@@ -10517,7 +10517,7 @@
     <w:p>
       <w:pPr>
         <w:shd w:fill="F2F4F7" w:color="auto" w:val="clear"/>
-        <w:spacing w:after="0" w:line="240"/>
+        <w:spacing w:after="120" w:line="240"/>
         <w:ind w:left="120" w:right="120"/>
       </w:pPr>
       <w:r>
@@ -10528,22 +10528,6 @@
           <w:szCs w:val="15"/>
         </w:rPr>
         <w:t xml:space="preserve">curl -X POST http://localhost:8080/predict -H "Content-Type: application/json" -d @samples/high_risk.json</w:t>
-      </w:r>
-    </w:p>
-    <w:p>
-      <w:pPr>
-        <w:shd w:fill="F2F4F7" w:color="auto" w:val="clear"/>
-        <w:spacing w:after="120" w:line="240"/>
-        <w:ind w:left="120" w:right="120"/>
-      </w:pPr>
-      <w:r>
-        <w:rPr>
-          <w:rFonts w:ascii="Consolas" w:cs="Consolas" w:eastAsia="Consolas" w:hAnsi="Consolas"/>
-          <w:color w:val="1E2A36"/>
-          <w:sz w:val="15"/>
-          <w:szCs w:val="15"/>
-        </w:rPr>
-        <w:t xml:space="preserve"># Swagger UI: http://localhost:8080/docs   ·   monitoring: kubectl apply -k deployment/monitoring</w:t>
       </w:r>
     </w:p>
     <w:p>
@@ -10722,7 +10706,7 @@
                 <w:sz w:val="16"/>
                 <w:szCs w:val="16"/>
               </w:rPr>
-              <w:t xml:space="preserve">Two replicas; rolling updates with surge 1 and unavailability 0, plus a 5-second pre-stop pause, so capacity never drops during an update; startup and readiness probes on /ready and a liveness probe on /health; CPU and memory requests and limits; a hardened security context (non-root user, read-only root filesystem, all Linux capabilities dropped, seccomp profile, no service-account token).</w:t>
+              <w:t xml:space="preserve">Two replicas; rolling updates with surge 1, unavailability 0 and a 5-second pre-stop pause, so capacity never drops; startup and readiness probes on /ready, liveness on /health; CPU and memory requests and limits; hardened security context (non-root, read-only root filesystem, all capabilities dropped, seccomp, no service-account token).</w:t>
             </w:r>
           </w:p>
         </w:tc>
@@ -11193,7 +11177,7 @@
                 <w:sz w:val="16"/>
                 <w:szCs w:val="16"/>
               </w:rPr>
-              <w:t xml:space="preserve">A replacement started within seconds; no request failed.</w:t>
+              <w:t xml:space="preserve">A replacement pod started within seconds; the Service continued routing to the healthy replica.</w:t>
             </w:r>
           </w:p>
         </w:tc>
@@ -11260,7 +11244,7 @@
                 <w:sz w:val="16"/>
                 <w:szCs w:val="16"/>
               </w:rPr>
-              <w:t xml:space="preserve">CPU rose from 5 % to 791 % of the request; the autoscaler scaled 2 → 5 → 2 replicas; 22,880 requests with 0 errors; median latency 100 ms, 95th percentile 300 ms.</w:t>
+              <w:t xml:space="preserve">CPU 5 % → 791 % of the request; autoscaler 2 → 5 → 2 replicas; 22,880 requests = 21,625 HTTP 200 + 1,255 HTTP 422 (the 5 % deliberately invalid inputs), 0 server and 0 connection errors; p50 100 ms, p95 300 ms.</w:t>
             </w:r>
           </w:p>
         </w:tc>
@@ -11327,7 +11311,7 @@
                 <w:sz w:val="16"/>
                 <w:szCs w:val="16"/>
               </w:rPr>
-              <w:t xml:space="preserve">Every replica replaced; 4,002 requests with 0 errors.</w:t>
+              <w:t xml:space="preserve">Every replica replaced; 4,002 requests = 3,779 HTTP 200 + 223 deliberate HTTP 422, 0 server and 0 connection errors.</w:t>
             </w:r>
           </w:p>
         </w:tc>
@@ -11457,7 +11441,7 @@
                 <wp:inline distT="0" distB="0" distL="0" distR="0">
                   <wp:extent cx="3124200" cy="790575"/>
                   <wp:effectExtent t="0" r="0" b="0" l="0"/>
-                  <wp:docPr id="1" name="c_task7_01_deployed.png" descr="Deployed resources: replicas, LoadBalancer service and autoscaler (left); load-test summary showing 22,880 requests without error (right)." title="c_task7_01_deployed.png"/>
+                  <wp:docPr id="1" name="c_task7_01_deployed.png" descr="Deployed resources: replicas, LoadBalancer service and autoscaler (left); load-test summary: 22,880 requests, 21,625 HTTP 200, 1,255 deliberate HTTP 422, 0 connection errors (right)." title="c_task7_01_deployed.png"/>
                   <wp:cNvGraphicFramePr>
                     <a:graphicFrameLocks xmlns:a="http://schemas.openxmlformats.org/drawingml/2006/main" noChangeAspect="1"/>
                   </wp:cNvGraphicFramePr>
@@ -11513,7 +11497,7 @@
                 <wp:inline distT="0" distB="0" distL="0" distR="0">
                   <wp:extent cx="3124200" cy="1857375"/>
                   <wp:effectExtent t="0" r="0" b="0" l="0"/>
-                  <wp:docPr id="1" name="c_task7_06_load_test.png" descr="Deployed resources: replicas, LoadBalancer service and autoscaler (left); load-test summary showing 22,880 requests without error (right)." title="c_task7_06_load_test.png"/>
+                  <wp:docPr id="1" name="c_task7_06_load_test.png" descr="Deployed resources: replicas, LoadBalancer service and autoscaler (left); load-test summary: 22,880 requests, 21,625 HTTP 200, 1,255 deliberate HTTP 422, 0 connection errors (right)." title="c_task7_06_load_test.png"/>
                   <wp:cNvGraphicFramePr>
                     <a:graphicFrameLocks xmlns:a="http://schemas.openxmlformats.org/drawingml/2006/main" noChangeAspect="1"/>
                   </wp:cNvGraphicFramePr>
@@ -11575,7 +11559,7 @@
           <w:sz w:val="16"/>
           <w:szCs w:val="16"/>
         </w:rPr>
-        <w:t xml:space="preserve">Deployed resources: replicas, LoadBalancer service and autoscaler (left); load-test summary showing 22,880 requests without error (right).</w:t>
+        <w:t xml:space="preserve">Deployed resources: replicas, LoadBalancer service and autoscaler (left); load-test summary: 22,880 requests, 21,625 HTTP 200, 1,255 deliberate HTTP 422, 0 connection errors (right).</w:t>
       </w:r>
     </w:p>
     <w:p>
@@ -11587,7 +11571,7 @@
       <w:r>
         <w:drawing>
           <wp:inline distT="0" distB="0" distL="0" distR="0">
-            <wp:extent cx="3990975" cy="790575"/>
+            <wp:extent cx="3219450" cy="638175"/>
             <wp:effectExtent t="0" r="0" b="0" l="0"/>
             <wp:docPr id="1" name="task7_05b_hpa_scale_down.png" descr="Autoscaler behaviour under load: CPU utilisation rises to 791 % of the request, the deployment scales from two to five replicas and returns to two when traffic stops." title="task7_05b_hpa_scale_down.png"/>
             <wp:cNvGraphicFramePr>
@@ -11612,7 +11596,7 @@
                   <pic:spPr bwMode="auto">
                     <a:xfrm>
                       <a:off x="0" y="0"/>
-                      <a:ext cx="3990975" cy="790575"/>
+                      <a:ext cx="3219450" cy="638175"/>
                     </a:xfrm>
                     <a:prstGeom prst="rect">
                       <a:avLst/>
@@ -11683,7 +11667,7 @@
         <w:t xml:space="preserve">Metrics.</w:t>
       </w:r>
       <w:r>
-        <w:t xml:space="preserve"> Every replica exposes request counts, a latency histogram, predictions per class, the distribution of predicted probabilities, rejected requests, summaries of each numeric input, the model version, CPU and memory use, and the training mean and standard deviation of each feature, read from the scaler of the model actually being served. Prometheus discovers the replicas through the Kubernetes API, so replicas added by the autoscaler are monitored automatically, and Grafana is provisioned entirely from configuration files. </w:t>
+        <w:t xml:space="preserve"> Every replica exposes request counts, a latency histogram, predictions per class, the distribution of predicted probabilities, rejected requests, summaries of each numeric input, the model version, CPU and memory use, and the training mean and standard deviation of each feature, read from the scaler of the model actually being served. Prometheus discovers replicas through the Kubernetes API, so autoscaled replicas are monitored automatically; Grafana is provisioned from files. </w:t>
       </w:r>
       <w:r>
         <w:rPr>
@@ -11709,7 +11693,7 @@
         <w:t xml:space="preserve">Drift detection.</w:t>
       </w:r>
       <w:r>
-        <w:t xml:space="preserve"> Because confirmed diagnoses arrive long after predictions, the service monitors its inputs, a recommended practice for detecting dataset shift [10]. For each feature, the drift score is the difference between the mean of the inputs received in the last 15 minutes and the training mean, divided by the training standard deviation; an alert fires when its magnitude exceeds 0.5 for five minutes. Under realistic traffic the scores remained within ±0.07. When an older, higher-risk population was sent, the scores reached +1.67 for age, −1.12 for maximum heart rate and +1.06 for cholesterol, the share of positive predictions rose from 43 % to 57 %, and the alert HeartApiInputDrift fired.</w:t>
+        <w:t xml:space="preserve"> Because confirmed diagnoses arrive long after predictions, the service monitors its inputs, a recommended practice for detecting dataset shift [10]. For each feature, the drift score is the difference between the mean of the inputs received in the last 15 minutes and the training mean, divided by the training standard deviation; an alert fires when its magnitude exceeds 0.5 for five minutes. Under realistic traffic the scores remained within ±0.07. When an older, higher-risk population was sent, all five monitored features left the ±0.5 band — age +1.67, maximum heart rate −1.12, cholesterol +1.06, ST depression +0.93 and resting blood pressure +0.89 — the share of positive predictions rose from 43 % to 57 %, and HeartApiInputDrift fired for the two features that had exceeded the threshold for five minutes (age and maximum heart rate). Input drift shows that the model is serving a population it was not trained on; it triggers a review but does not by itself prove that prediction quality has degraded, which can only be confirmed once true diagnoses arrive.</w:t>
       </w:r>
     </w:p>
     <w:p>
@@ -11721,7 +11705,7 @@
       <w:r>
         <w:drawing>
           <wp:inline distT="0" distB="0" distL="0" distR="0">
-            <wp:extent cx="6438900" cy="1162050"/>
+            <wp:extent cx="5791200" cy="1038225"/>
             <wp:effectExtent t="0" r="0" b="0" l="0"/>
             <wp:docPr id="1" name="c_task8_07_grafana_drift.png" descr="Grafana drift panels during the population shift: every monitored feature leaves the ±0.5 band (left); recent versus training means, with age at +1.67 standard deviations (right)." title="c_task8_07_grafana_drift.png"/>
             <wp:cNvGraphicFramePr>
@@ -11746,7 +11730,7 @@
                   <pic:spPr bwMode="auto">
                     <a:xfrm>
                       <a:off x="0" y="0"/>
-                      <a:ext cx="6438900" cy="1162050"/>
+                      <a:ext cx="5791200" cy="1038225"/>
                     </a:xfrm>
                     <a:prstGeom prst="rect">
                       <a:avLst/>
@@ -11794,7 +11778,7 @@
       <w:r>
         <w:drawing>
           <wp:inline distT="0" distB="0" distL="0" distR="0">
-            <wp:extent cx="5153025" cy="762000"/>
+            <wp:extent cx="3543300" cy="523875"/>
             <wp:effectExtent t="0" r="0" b="0" l="0"/>
             <wp:docPr id="1" name="c_task8_08_drift_alert.png" descr="Prometheus: HeartApiInputDrift firing for age and maximum heart rate (thalach); chol, oldpeak and trestbps pending." title="c_task8_08_drift_alert.png"/>
             <wp:cNvGraphicFramePr>
@@ -11819,7 +11803,7 @@
                   <pic:spPr bwMode="auto">
                     <a:xfrm>
                       <a:off x="0" y="0"/>
-                      <a:ext cx="5153025" cy="762000"/>
+                      <a:ext cx="3543300" cy="523875"/>
                     </a:xfrm>
                     <a:prstGeom prst="rect">
                       <a:avLst/>
@@ -11879,7 +11863,7 @@
         <w:t xml:space="preserve">Problems encountered.</w:t>
       </w:r>
       <w:r>
-        <w:t xml:space="preserve"> Development exposed several realistic failure modes, each of which was fixed and protected by a check: Windows line endings altered the data checksum (resolved by normalised hashing); eight requests failed during an early rolling update because pods terminated before leaving the load balancer (resolved by a pre-stop pause, after which 4,002 requests passed without error); a model trained with a newer scikit-learn could not be loaded on Python 3.10 (resolved by a version check and locked-version tests); and the Prayogshala run revealed suppressed notebook charts and a pipeline script that ignored a lint failure (both corrected and re-verified). </w:t>
+        <w:t xml:space="preserve"> Development exposed several realistic failure modes, each of which was fixed and protected by a check: Windows line endings altered the data checksum (resolved by normalised hashing); eight requests failed during an early rolling update because pods terminated before leaving the load balancer (resolved by a pre-stop pause, after which a 4,002-request rolling update produced no connection or server errors); a model trained with a newer scikit-learn could not be loaded on Python 3.10 (resolved by a version check and locked-version tests); and the Prayogshala run revealed suppressed notebook charts and a pipeline script that ignored a lint failure (both corrected and re-verified). </w:t>
       </w:r>
       <w:r>
         <w:rPr>
@@ -11899,7 +11883,7 @@
         <w:t xml:space="preserve">Conclusion.</w:t>
       </w:r>
       <w:r>
-        <w:t xml:space="preserve"> All tasks of the assignment have been implemented, executed and evidenced, and the resulting system exhibits the properties expected of a production service: it is reproducible, tested, self-healing, scalable and observable.</w:t>
+        <w:t xml:space="preserve"> All nine tasks of the assignment have been implemented, executed and evidenced. The result is a production-oriented prototype that is reproducible, tested, self-healing, scalable and observable in a local Kubernetes environment. Its discriminative performance on this dataset is promising, but the small held-out set means it is not a clinical validation, and the deployment demonstrates an engineering workflow rather than a publicly operated clinical service.</w:t>
       </w:r>
     </w:p>
     <w:p>

</xml_diff>